<commit_message>
Cleaning up on HP
</commit_message>
<xml_diff>
--- a/Project_Management/Satellite_Listening.docx
+++ b/Project_Management/Satellite_Listening.docx
@@ -20,107 +20,6 @@
           <w:szCs w:val="40"/>
         </w:rPr>
         <w:t>Satellite Listening Plan</w:t>
-      </w:r>
-    </w:p>
-    <w:p>
-      <w:pPr>
-        <w:jc w:val="center"/>
-        <w:rPr>
-          <w:b/>
-          <w:bCs/>
-          <w:sz w:val="40"/>
-          <w:szCs w:val="40"/>
-        </w:rPr>
-      </w:pPr>
-    </w:p>
-    <w:p>
-      <w:pPr>
-        <w:jc w:val="center"/>
-        <w:rPr>
-          <w:i/>
-          <w:iCs/>
-          <w:strike/>
-          <w:color w:val="FF0000"/>
-          <w:sz w:val="20"/>
-          <w:szCs w:val="20"/>
-        </w:rPr>
-      </w:pPr>
-      <w:r>
-        <w:rPr>
-          <w:i/>
-          <w:iCs/>
-          <w:strike/>
-          <w:color w:val="FF0000"/>
-          <w:sz w:val="20"/>
-          <w:szCs w:val="20"/>
-        </w:rPr>
-        <w:t>Checked Out – Active is in Shared</w:t>
-      </w:r>
-    </w:p>
-    <w:p>
-      <w:pPr>
-        <w:jc w:val="center"/>
-        <w:rPr>
-          <w:b/>
-          <w:bCs/>
-          <w:color w:val="FF0000"/>
-          <w:sz w:val="40"/>
-          <w:szCs w:val="40"/>
-        </w:rPr>
-      </w:pPr>
-    </w:p>
-    <w:p>
-      <w:pPr>
-        <w:jc w:val="center"/>
-        <w:rPr>
-          <w:b/>
-          <w:bCs/>
-          <w:color w:val="00B050"/>
-          <w:sz w:val="40"/>
-          <w:szCs w:val="40"/>
-        </w:rPr>
-      </w:pPr>
-      <w:r>
-        <w:rPr>
-          <w:b/>
-          <w:bCs/>
-          <w:color w:val="00B050"/>
-          <w:sz w:val="40"/>
-          <w:szCs w:val="40"/>
-        </w:rPr>
-        <w:t xml:space="preserve">This is </w:t>
-      </w:r>
-      <w:proofErr w:type="gramStart"/>
-      <w:r>
-        <w:rPr>
-          <w:b/>
-          <w:bCs/>
-          <w:color w:val="00B050"/>
-          <w:sz w:val="40"/>
-          <w:szCs w:val="40"/>
-        </w:rPr>
-        <w:t xml:space="preserve">the </w:t>
-      </w:r>
-      <w:r>
-        <w:rPr>
-          <w:b/>
-          <w:bCs/>
-          <w:color w:val="00B050"/>
-          <w:sz w:val="40"/>
-          <w:szCs w:val="40"/>
-        </w:rPr>
-        <w:t>Active</w:t>
-      </w:r>
-      <w:proofErr w:type="gramEnd"/>
-      <w:r>
-        <w:rPr>
-          <w:b/>
-          <w:bCs/>
-          <w:color w:val="00B050"/>
-          <w:sz w:val="40"/>
-          <w:szCs w:val="40"/>
-        </w:rPr>
-        <w:t xml:space="preserve"> in Shared</w:t>
       </w:r>
     </w:p>
     <w:p/>
@@ -1198,6 +1097,7 @@
   <w:style w:type="character" w:default="1" w:styleId="DefaultParagraphFont">
     <w:name w:val="Default Paragraph Font"/>
     <w:uiPriority w:val="1"/>
+    <w:semiHidden/>
     <w:unhideWhenUsed/>
   </w:style>
   <w:style w:type="table" w:default="1" w:styleId="TableNormal">

</xml_diff>

<commit_message>
Updating 70 cm Analysis
</commit_message>
<xml_diff>
--- a/Project_Management/Satellite_Listening.docx
+++ b/Project_Management/Satellite_Listening.docx
@@ -124,7 +124,10 @@
     </w:p>
     <w:p>
       <w:r>
-        <w:t xml:space="preserve">Rig </w:t>
+        <w:t>R</w:t>
+      </w:r>
+      <w:r>
+        <w:t>TL-SDR</w:t>
       </w:r>
     </w:p>
     <w:p>
@@ -149,13 +152,8 @@
         <w:t>Plan</w:t>
       </w:r>
     </w:p>
+    <w:p/>
     <w:p>
-      <w:pPr>
-        <w:numPr>
-          <w:ilvl w:val="0"/>
-          <w:numId w:val="2"/>
-        </w:numPr>
-      </w:pPr>
       <w:r>
         <w:t>Listening on D74</w:t>
       </w:r>

</xml_diff>